<commit_message>
update before the presentation
</commit_message>
<xml_diff>
--- a/2. Projects/5. Final Submission/Vending Machine Controller Project Documentation.docx
+++ b/2. Projects/5. Final Submission/Vending Machine Controller Project Documentation.docx
@@ -434,7 +434,29 @@
           <w:sz w:val="32"/>
           <w:szCs w:val="32"/>
         </w:rPr>
-        <w:t>2.1 Agile Development [1]</w:t>
+        <w:t>2.1 Agile Development [</w:t>
+      </w:r>
+      <w:r>
+        <w:rPr>
+          <w:rFonts w:ascii="Arial" w:eastAsia="Times New Roman" w:hAnsi="Arial" w:cs="Arial"/>
+          <w:b/>
+          <w:bCs/>
+          <w:color w:val="000000"/>
+          <w:sz w:val="32"/>
+          <w:szCs w:val="32"/>
+        </w:rPr>
+        <w:t>2</w:t>
+      </w:r>
+      <w:r>
+        <w:rPr>
+          <w:rFonts w:ascii="Arial" w:eastAsia="Times New Roman" w:hAnsi="Arial" w:cs="Arial"/>
+          <w:b/>
+          <w:bCs/>
+          <w:color w:val="000000"/>
+          <w:sz w:val="32"/>
+          <w:szCs w:val="32"/>
+        </w:rPr>
+        <w:t>]</w:t>
       </w:r>
     </w:p>
     <w:p>
@@ -764,7 +786,19 @@
                               <w:rPr>
                                 <w:rFonts w:ascii="Arial" w:hAnsi="Arial" w:cs="Arial"/>
                               </w:rPr>
-                              <w:t xml:space="preserve"> [0]</w:t>
+                              <w:t xml:space="preserve"> [</w:t>
+                            </w:r>
+                            <w:r>
+                              <w:rPr>
+                                <w:rFonts w:ascii="Arial" w:hAnsi="Arial" w:cs="Arial"/>
+                              </w:rPr>
+                              <w:t>1</w:t>
+                            </w:r>
+                            <w:r>
+                              <w:rPr>
+                                <w:rFonts w:ascii="Arial" w:hAnsi="Arial" w:cs="Arial"/>
+                              </w:rPr>
+                              <w:t>]</w:t>
                             </w:r>
                           </w:p>
                         </w:txbxContent>
@@ -812,7 +846,19 @@
                         <w:rPr>
                           <w:rFonts w:ascii="Arial" w:hAnsi="Arial" w:cs="Arial"/>
                         </w:rPr>
-                        <w:t xml:space="preserve"> [0]</w:t>
+                        <w:t xml:space="preserve"> [</w:t>
+                      </w:r>
+                      <w:r>
+                        <w:rPr>
+                          <w:rFonts w:ascii="Arial" w:hAnsi="Arial" w:cs="Arial"/>
+                        </w:rPr>
+                        <w:t>1</w:t>
+                      </w:r>
+                      <w:r>
+                        <w:rPr>
+                          <w:rFonts w:ascii="Arial" w:hAnsi="Arial" w:cs="Arial"/>
+                        </w:rPr>
+                        <w:t>]</w:t>
                       </w:r>
                     </w:p>
                   </w:txbxContent>
@@ -822,6 +868,7 @@
           </mc:Fallback>
         </mc:AlternateContent>
       </w:r>
+      <w:bookmarkStart w:id="0" w:name="_GoBack"/>
       <w:r>
         <w:rPr>
           <w:rFonts w:ascii="Arial" w:eastAsia="Times New Roman" w:hAnsi="Arial" w:cs="Arial"/>
@@ -878,6 +925,7 @@
           </wp:inline>
         </w:drawing>
       </w:r>
+      <w:bookmarkEnd w:id="0"/>
     </w:p>
     <w:p>
       <w:pPr>
@@ -1094,11 +1142,34 @@
                       <wps:txbx>
                         <w:txbxContent>
                           <w:p>
+                            <w:pPr>
+                              <w:rPr>
+                                <w:rFonts w:ascii="Arial" w:hAnsi="Arial" w:cs="Arial"/>
+                              </w:rPr>
+                            </w:pPr>
                             <w:r>
+                              <w:rPr>
+                                <w:rFonts w:ascii="Arial" w:hAnsi="Arial" w:cs="Arial"/>
+                              </w:rPr>
                               <w:t>Figure 2. State Machine Diagram</w:t>
                             </w:r>
                             <w:r>
-                              <w:t xml:space="preserve"> [0]</w:t>
+                              <w:rPr>
+                                <w:rFonts w:ascii="Arial" w:hAnsi="Arial" w:cs="Arial"/>
+                              </w:rPr>
+                              <w:t xml:space="preserve"> [</w:t>
+                            </w:r>
+                            <w:r>
+                              <w:rPr>
+                                <w:rFonts w:ascii="Arial" w:hAnsi="Arial" w:cs="Arial"/>
+                              </w:rPr>
+                              <w:t>1</w:t>
+                            </w:r>
+                            <w:r>
+                              <w:rPr>
+                                <w:rFonts w:ascii="Arial" w:hAnsi="Arial" w:cs="Arial"/>
+                              </w:rPr>
+                              <w:t>]</w:t>
                             </w:r>
                           </w:p>
                         </w:txbxContent>
@@ -1124,11 +1195,34 @@
                 <v:textbox>
                   <w:txbxContent>
                     <w:p>
+                      <w:pPr>
+                        <w:rPr>
+                          <w:rFonts w:ascii="Arial" w:hAnsi="Arial" w:cs="Arial"/>
+                        </w:rPr>
+                      </w:pPr>
                       <w:r>
+                        <w:rPr>
+                          <w:rFonts w:ascii="Arial" w:hAnsi="Arial" w:cs="Arial"/>
+                        </w:rPr>
                         <w:t>Figure 2. State Machine Diagram</w:t>
                       </w:r>
                       <w:r>
-                        <w:t xml:space="preserve"> [0]</w:t>
+                        <w:rPr>
+                          <w:rFonts w:ascii="Arial" w:hAnsi="Arial" w:cs="Arial"/>
+                        </w:rPr>
+                        <w:t xml:space="preserve"> [</w:t>
+                      </w:r>
+                      <w:r>
+                        <w:rPr>
+                          <w:rFonts w:ascii="Arial" w:hAnsi="Arial" w:cs="Arial"/>
+                        </w:rPr>
+                        <w:t>1</w:t>
+                      </w:r>
+                      <w:r>
+                        <w:rPr>
+                          <w:rFonts w:ascii="Arial" w:hAnsi="Arial" w:cs="Arial"/>
+                        </w:rPr>
+                        <w:t>]</w:t>
                       </w:r>
                     </w:p>
                   </w:txbxContent>
@@ -1659,7 +1753,14 @@
           <w:rFonts w:ascii="Arial" w:eastAsia="Times New Roman" w:hAnsi="Arial" w:cs="Arial"/>
           <w:color w:val="000000"/>
         </w:rPr>
-        <w:t>5]</w:t>
+        <w:t>6</w:t>
+      </w:r>
+      <w:r>
+        <w:rPr>
+          <w:rFonts w:ascii="Arial" w:eastAsia="Times New Roman" w:hAnsi="Arial" w:cs="Arial"/>
+          <w:color w:val="000000"/>
+        </w:rPr>
+        <w:t>]</w:t>
       </w:r>
     </w:p>
     <w:p>
@@ -1966,7 +2067,29 @@
           <w:sz w:val="32"/>
           <w:szCs w:val="32"/>
         </w:rPr>
-        <w:t>4.1 VHDL, ModelSim and Test Benches [2,3,4] (Choi)</w:t>
+        <w:t>4.1 VHDL, ModelSim and Test Benches [</w:t>
+      </w:r>
+      <w:r>
+        <w:rPr>
+          <w:rFonts w:ascii="Arial" w:eastAsia="Times New Roman" w:hAnsi="Arial" w:cs="Arial"/>
+          <w:b/>
+          <w:bCs/>
+          <w:color w:val="000000"/>
+          <w:sz w:val="32"/>
+          <w:szCs w:val="32"/>
+        </w:rPr>
+        <w:t>3,4,5</w:t>
+      </w:r>
+      <w:r>
+        <w:rPr>
+          <w:rFonts w:ascii="Arial" w:eastAsia="Times New Roman" w:hAnsi="Arial" w:cs="Arial"/>
+          <w:b/>
+          <w:bCs/>
+          <w:color w:val="000000"/>
+          <w:sz w:val="32"/>
+          <w:szCs w:val="32"/>
+        </w:rPr>
+        <w:t>] (Choi)</w:t>
       </w:r>
     </w:p>
     <w:p>
@@ -2197,7 +2320,21 @@
           <w:rFonts w:ascii="Arial" w:eastAsia="Times New Roman" w:hAnsi="Arial" w:cs="Arial"/>
           <w:color w:val="000000"/>
         </w:rPr>
-        <w:t>PCB (Printed Circuit Board) is a flat board that holds and connects electronic components using wires. PCB prototyping is a process of designing and creating a test version of PCB before full scale production. It helps to check if circuit design works as expected and allows for fixing any errors early. [6]</w:t>
+        <w:t>PCB (Printed Circuit Board) is a flat board that holds and connects electronic components using wires. PCB prototyping is a process of designing and creating a test version of PCB before full scale production. It helps to check if circuit design works as expected and allows for fixing any errors early. [</w:t>
+      </w:r>
+      <w:r>
+        <w:rPr>
+          <w:rFonts w:ascii="Arial" w:eastAsia="Times New Roman" w:hAnsi="Arial" w:cs="Arial"/>
+          <w:color w:val="000000"/>
+        </w:rPr>
+        <w:t>7</w:t>
+      </w:r>
+      <w:r>
+        <w:rPr>
+          <w:rFonts w:ascii="Arial" w:eastAsia="Times New Roman" w:hAnsi="Arial" w:cs="Arial"/>
+          <w:color w:val="000000"/>
+        </w:rPr>
+        <w:t>]</w:t>
       </w:r>
     </w:p>
     <w:p>
@@ -3819,7 +3956,13 @@
                               <w:t>Figure 3. Results of FSM_Controller test bench</w:t>
                             </w:r>
                             <w:r>
-                              <w:t xml:space="preserve"> [0]</w:t>
+                              <w:t xml:space="preserve"> [</w:t>
+                            </w:r>
+                            <w:r>
+                              <w:t>1</w:t>
+                            </w:r>
+                            <w:r>
+                              <w:t>]</w:t>
                             </w:r>
                           </w:p>
                         </w:txbxContent>
@@ -3849,7 +3992,13 @@
                         <w:t>Figure 3. Results of FSM_Controller test bench</w:t>
                       </w:r>
                       <w:r>
-                        <w:t xml:space="preserve"> [0]</w:t>
+                        <w:t xml:space="preserve"> [</w:t>
+                      </w:r>
+                      <w:r>
+                        <w:t>1</w:t>
+                      </w:r>
+                      <w:r>
+                        <w:t>]</w:t>
                       </w:r>
                     </w:p>
                   </w:txbxContent>
@@ -4269,22 +4418,16 @@
                         <w:txbxContent>
                           <w:p>
                             <w:r>
-                              <w:t xml:space="preserve">Figure </w:t>
+                              <w:t>Figure 4. Results of Display_Manager test bench</w:t>
                             </w:r>
                             <w:r>
-                              <w:t>4</w:t>
+                              <w:t xml:space="preserve"> [</w:t>
                             </w:r>
                             <w:r>
-                              <w:t xml:space="preserve">. Results of </w:t>
+                              <w:t>1</w:t>
                             </w:r>
                             <w:r>
-                              <w:t xml:space="preserve">Display_Manager </w:t>
-                            </w:r>
-                            <w:r>
-                              <w:t>test bench</w:t>
-                            </w:r>
-                            <w:r>
-                              <w:t xml:space="preserve"> [0]</w:t>
+                              <w:t>]</w:t>
                             </w:r>
                           </w:p>
                         </w:txbxContent>
@@ -4311,22 +4454,16 @@
                   <w:txbxContent>
                     <w:p>
                       <w:r>
-                        <w:t xml:space="preserve">Figure </w:t>
+                        <w:t>Figure 4. Results of Display_Manager test bench</w:t>
                       </w:r>
                       <w:r>
-                        <w:t>4</w:t>
+                        <w:t xml:space="preserve"> [</w:t>
                       </w:r>
                       <w:r>
-                        <w:t xml:space="preserve">. Results of </w:t>
+                        <w:t>1</w:t>
                       </w:r>
                       <w:r>
-                        <w:t xml:space="preserve">Display_Manager </w:t>
-                      </w:r>
-                      <w:r>
-                        <w:t>test bench</w:t>
-                      </w:r>
-                      <w:r>
-                        <w:t xml:space="preserve"> [0]</w:t>
+                        <w:t>]</w:t>
                       </w:r>
                     </w:p>
                   </w:txbxContent>
@@ -4596,22 +4733,16 @@
                         <w:txbxContent>
                           <w:p>
                             <w:r>
-                              <w:t xml:space="preserve">Figure </w:t>
+                              <w:t>Figure 5. Results of Coin_Handler test bench</w:t>
                             </w:r>
                             <w:r>
-                              <w:t>5</w:t>
+                              <w:t xml:space="preserve"> [</w:t>
                             </w:r>
                             <w:r>
-                              <w:t xml:space="preserve">. Results of </w:t>
+                              <w:t>1</w:t>
                             </w:r>
                             <w:r>
-                              <w:t>Coin_Handler</w:t>
-                            </w:r>
-                            <w:r>
-                              <w:t xml:space="preserve"> test bench</w:t>
-                            </w:r>
-                            <w:r>
-                              <w:t xml:space="preserve"> [0]</w:t>
+                              <w:t>]</w:t>
                             </w:r>
                           </w:p>
                         </w:txbxContent>
@@ -4638,22 +4769,16 @@
                   <w:txbxContent>
                     <w:p>
                       <w:r>
-                        <w:t xml:space="preserve">Figure </w:t>
+                        <w:t>Figure 5. Results of Coin_Handler test bench</w:t>
                       </w:r>
                       <w:r>
-                        <w:t>5</w:t>
+                        <w:t xml:space="preserve"> [</w:t>
                       </w:r>
                       <w:r>
-                        <w:t xml:space="preserve">. Results of </w:t>
+                        <w:t>1</w:t>
                       </w:r>
                       <w:r>
-                        <w:t>Coin_Handler</w:t>
-                      </w:r>
-                      <w:r>
-                        <w:t xml:space="preserve"> test bench</w:t>
-                      </w:r>
-                      <w:r>
-                        <w:t xml:space="preserve"> [0]</w:t>
+                        <w:t>]</w:t>
                       </w:r>
                     </w:p>
                   </w:txbxContent>
@@ -4887,30 +5012,16 @@
                         <w:txbxContent>
                           <w:p>
                             <w:r>
-                              <w:t xml:space="preserve">Figure </w:t>
-                            </w:r>
-                            <w:r>
-                              <w:t>6</w:t>
-                            </w:r>
-                            <w:r>
-                              <w:t xml:space="preserve">. </w:t>
-                            </w:r>
-                            <w:r>
-                              <w:t xml:space="preserve">Block </w:t>
-                            </w:r>
-                            <w:proofErr w:type="gramStart"/>
-                            <w:r>
-                              <w:t>Diagram</w:t>
-                            </w:r>
-                            <w:r>
-                              <w:t xml:space="preserve"> </w:t>
+                              <w:t>Figure 6. Block Diagram</w:t>
                             </w:r>
                             <w:r>
                               <w:t xml:space="preserve"> [</w:t>
                             </w:r>
-                            <w:proofErr w:type="gramEnd"/>
                             <w:r>
-                              <w:t>0]</w:t>
+                              <w:t>1</w:t>
+                            </w:r>
+                            <w:r>
+                              <w:t>]</w:t>
                             </w:r>
                           </w:p>
                         </w:txbxContent>
@@ -4937,30 +5048,16 @@
                   <w:txbxContent>
                     <w:p>
                       <w:r>
-                        <w:t xml:space="preserve">Figure </w:t>
-                      </w:r>
-                      <w:r>
-                        <w:t>6</w:t>
-                      </w:r>
-                      <w:r>
-                        <w:t xml:space="preserve">. </w:t>
-                      </w:r>
-                      <w:r>
-                        <w:t xml:space="preserve">Block </w:t>
-                      </w:r>
-                      <w:proofErr w:type="gramStart"/>
-                      <w:r>
-                        <w:t>Diagram</w:t>
-                      </w:r>
-                      <w:r>
-                        <w:t xml:space="preserve"> </w:t>
+                        <w:t>Figure 6. Block Diagram</w:t>
                       </w:r>
                       <w:r>
                         <w:t xml:space="preserve"> [</w:t>
                       </w:r>
-                      <w:proofErr w:type="gramEnd"/>
                       <w:r>
-                        <w:t>0]</w:t>
+                        <w:t>1</w:t>
+                      </w:r>
+                      <w:r>
+                        <w:t>]</w:t>
                       </w:r>
                     </w:p>
                   </w:txbxContent>
@@ -5104,17 +5201,15 @@
           <w:iCs/>
           <w:color w:val="000000"/>
         </w:rPr>
-        <w:t xml:space="preserve">In the VHDL code, we have four </w:t>
-      </w:r>
-      <w:proofErr w:type="spellStart"/>
-      <w:proofErr w:type="gramStart"/>
+        <w:t>In the VHDL code, we have four modules:</w:t>
+      </w:r>
       <w:r>
         <w:rPr>
           <w:rFonts w:ascii="Arial" w:eastAsia="Times New Roman" w:hAnsi="Arial" w:cs="Arial"/>
           <w:iCs/>
           <w:color w:val="000000"/>
         </w:rPr>
-        <w:t>modules:</w:t>
+        <w:t xml:space="preserve"> </w:t>
       </w:r>
       <w:r>
         <w:rPr>
@@ -5124,9 +5219,16 @@
           <w:iCs/>
           <w:color w:val="000000"/>
         </w:rPr>
-        <w:t>Coin</w:t>
-      </w:r>
-      <w:proofErr w:type="gramEnd"/>
+        <w:t>Coin_Handler</w:t>
+      </w:r>
+      <w:r>
+        <w:rPr>
+          <w:rFonts w:ascii="Arial" w:eastAsia="Times New Roman" w:hAnsi="Arial" w:cs="Arial"/>
+          <w:iCs/>
+          <w:color w:val="000000"/>
+        </w:rPr>
+        <w:t xml:space="preserve">, </w:t>
+      </w:r>
       <w:r>
         <w:rPr>
           <w:rFonts w:ascii="Arial" w:eastAsia="Times New Roman" w:hAnsi="Arial" w:cs="Arial"/>
@@ -5135,16 +5237,15 @@
           <w:iCs/>
           <w:color w:val="000000"/>
         </w:rPr>
-        <w:t>_Handler</w:t>
-      </w:r>
-      <w:proofErr w:type="spellEnd"/>
+        <w:t xml:space="preserve">FSM_Controller, Display_Manager, </w:t>
+      </w:r>
       <w:r>
         <w:rPr>
           <w:rFonts w:ascii="Arial" w:eastAsia="Times New Roman" w:hAnsi="Arial" w:cs="Arial"/>
           <w:iCs/>
           <w:color w:val="000000"/>
         </w:rPr>
-        <w:t xml:space="preserve">, </w:t>
+        <w:t xml:space="preserve">and </w:t>
       </w:r>
       <w:r>
         <w:rPr>
@@ -5154,24 +5255,6 @@
           <w:iCs/>
           <w:color w:val="000000"/>
         </w:rPr>
-        <w:t xml:space="preserve">FSM_Controller, Display_Manager, </w:t>
-      </w:r>
-      <w:r>
-        <w:rPr>
-          <w:rFonts w:ascii="Arial" w:eastAsia="Times New Roman" w:hAnsi="Arial" w:cs="Arial"/>
-          <w:iCs/>
-          <w:color w:val="000000"/>
-        </w:rPr>
-        <w:t xml:space="preserve">and </w:t>
-      </w:r>
-      <w:r>
-        <w:rPr>
-          <w:rFonts w:ascii="Arial" w:eastAsia="Times New Roman" w:hAnsi="Arial" w:cs="Arial"/>
-          <w:b/>
-          <w:bCs/>
-          <w:iCs/>
-          <w:color w:val="000000"/>
-        </w:rPr>
         <w:t>Top Module.</w:t>
       </w:r>
     </w:p>
@@ -5213,27 +5296,23 @@
           <w:iCs/>
           <w:color w:val="000000"/>
         </w:rPr>
-        <w:t xml:space="preserve">In this </w:t>
-      </w:r>
-      <w:proofErr w:type="spellStart"/>
-      <w:proofErr w:type="gramStart"/>
+        <w:t>In this module,</w:t>
+      </w:r>
       <w:r>
         <w:rPr>
           <w:rFonts w:ascii="Arial" w:eastAsia="Times New Roman" w:hAnsi="Arial" w:cs="Arial"/>
           <w:iCs/>
           <w:color w:val="000000"/>
         </w:rPr>
-        <w:t>module,the</w:t>
-      </w:r>
-      <w:proofErr w:type="spellEnd"/>
-      <w:proofErr w:type="gramEnd"/>
+        <w:t xml:space="preserve"> </w:t>
+      </w:r>
       <w:r>
         <w:rPr>
           <w:rFonts w:ascii="Arial" w:eastAsia="Times New Roman" w:hAnsi="Arial" w:cs="Arial"/>
           <w:iCs/>
           <w:color w:val="000000"/>
         </w:rPr>
-        <w:t xml:space="preserve"> system detects button presses and increases the inserted amount accordingly. Supports 4 coin values via BTNU, BTND, BTNL, BTNR (10, 100, 20, 50 cents respectively).</w:t>
+        <w:t>the system detects button presses and increases the inserted amount accordingly. Supports 4 coin values via BTNU, BTND, BTNL, BTNR (10, 100, 20, 50 cents respectively).</w:t>
       </w:r>
     </w:p>
     <w:p>
@@ -5557,22 +5636,16 @@
                         <w:txbxContent>
                           <w:p>
                             <w:r>
-                              <w:t xml:space="preserve">Figure </w:t>
+                              <w:t>Figure 7. Constraint File</w:t>
                             </w:r>
                             <w:r>
-                              <w:t>7</w:t>
+                              <w:t xml:space="preserve"> [</w:t>
                             </w:r>
                             <w:r>
-                              <w:t xml:space="preserve">. </w:t>
+                              <w:t>1</w:t>
                             </w:r>
                             <w:r>
-                              <w:t>Constraint File</w:t>
-                            </w:r>
-                            <w:r>
-                              <w:t xml:space="preserve"> </w:t>
-                            </w:r>
-                            <w:r>
-                              <w:t>[0]</w:t>
+                              <w:t>]</w:t>
                             </w:r>
                           </w:p>
                         </w:txbxContent>
@@ -5599,22 +5672,16 @@
                   <w:txbxContent>
                     <w:p>
                       <w:r>
-                        <w:t xml:space="preserve">Figure </w:t>
+                        <w:t>Figure 7. Constraint File</w:t>
                       </w:r>
                       <w:r>
-                        <w:t>7</w:t>
+                        <w:t xml:space="preserve"> [</w:t>
                       </w:r>
                       <w:r>
-                        <w:t xml:space="preserve">. </w:t>
+                        <w:t>1</w:t>
                       </w:r>
                       <w:r>
-                        <w:t>Constraint File</w:t>
-                      </w:r>
-                      <w:r>
-                        <w:t xml:space="preserve"> </w:t>
-                      </w:r>
-                      <w:r>
-                        <w:t>[0]</w:t>
+                        <w:t>]</w:t>
                       </w:r>
                     </w:p>
                   </w:txbxContent>
@@ -5886,22 +5953,16 @@
                         <w:txbxContent>
                           <w:p>
                             <w:r>
-                              <w:t xml:space="preserve">Figure </w:t>
+                              <w:t>Figure 8. Synthesis Report</w:t>
                             </w:r>
                             <w:r>
-                              <w:t>8</w:t>
+                              <w:t xml:space="preserve"> [</w:t>
                             </w:r>
                             <w:r>
-                              <w:t xml:space="preserve">. </w:t>
+                              <w:t>1</w:t>
                             </w:r>
                             <w:r>
-                              <w:t>Synthesis Report</w:t>
-                            </w:r>
-                            <w:r>
-                              <w:t xml:space="preserve"> </w:t>
-                            </w:r>
-                            <w:r>
-                              <w:t>[0]</w:t>
+                              <w:t>]</w:t>
                             </w:r>
                           </w:p>
                         </w:txbxContent>
@@ -5928,22 +5989,16 @@
                   <w:txbxContent>
                     <w:p>
                       <w:r>
-                        <w:t xml:space="preserve">Figure </w:t>
+                        <w:t>Figure 8. Synthesis Report</w:t>
                       </w:r>
                       <w:r>
-                        <w:t>8</w:t>
+                        <w:t xml:space="preserve"> [</w:t>
                       </w:r>
                       <w:r>
-                        <w:t xml:space="preserve">. </w:t>
+                        <w:t>1</w:t>
                       </w:r>
                       <w:r>
-                        <w:t>Synthesis Report</w:t>
-                      </w:r>
-                      <w:r>
-                        <w:t xml:space="preserve"> </w:t>
-                      </w:r>
-                      <w:r>
-                        <w:t>[0]</w:t>
+                        <w:t>]</w:t>
                       </w:r>
                     </w:p>
                   </w:txbxContent>
@@ -6191,10 +6246,17 @@
       </w:pPr>
       <w:r>
         <w:rPr>
-          <w:rFonts w:ascii="Arial" w:eastAsia="Times New Roman" w:hAnsi="Arial" w:cs="Arial"/>
-          <w:color w:val="000000"/>
-        </w:rPr>
-        <w:t>The schematic is the first step in PCB development. It shows the logical circuit, including all components and their connections, ensuring correct circuit behavior before layout. our schematic includes: </w:t>
+          <w:rFonts w:ascii="Arial" w:hAnsi="Arial" w:cs="Arial"/>
+          <w:color w:val="000000"/>
+        </w:rPr>
+        <w:t>The schematic is the first step in PCB development. It shows the logical circuit, including all components and their connections, ensuring correct circuit behavior before layout. our schematic includes</w:t>
+      </w:r>
+      <w:r>
+        <w:rPr>
+          <w:rFonts w:ascii="Arial" w:eastAsia="Times New Roman" w:hAnsi="Arial" w:cs="Arial"/>
+          <w:color w:val="000000"/>
+        </w:rPr>
+        <w:t>: </w:t>
       </w:r>
     </w:p>
     <w:p>
@@ -6400,22 +6462,16 @@
                         <w:txbxContent>
                           <w:p>
                             <w:r>
-                              <w:t xml:space="preserve">Figure </w:t>
+                              <w:t>Figure 9. Schematics</w:t>
                             </w:r>
                             <w:r>
-                              <w:t>9</w:t>
+                              <w:t xml:space="preserve"> [</w:t>
                             </w:r>
                             <w:r>
-                              <w:t xml:space="preserve">. </w:t>
+                              <w:t>1</w:t>
                             </w:r>
                             <w:r>
-                              <w:t>Schematics</w:t>
-                            </w:r>
-                            <w:r>
-                              <w:t xml:space="preserve"> </w:t>
-                            </w:r>
-                            <w:r>
-                              <w:t>[0]</w:t>
+                              <w:t>]</w:t>
                             </w:r>
                           </w:p>
                         </w:txbxContent>
@@ -6442,22 +6498,16 @@
                   <w:txbxContent>
                     <w:p>
                       <w:r>
-                        <w:t xml:space="preserve">Figure </w:t>
+                        <w:t>Figure 9. Schematics</w:t>
                       </w:r>
                       <w:r>
-                        <w:t>9</w:t>
+                        <w:t xml:space="preserve"> [</w:t>
                       </w:r>
                       <w:r>
-                        <w:t xml:space="preserve">. </w:t>
+                        <w:t>1</w:t>
                       </w:r>
                       <w:r>
-                        <w:t>Schematics</w:t>
-                      </w:r>
-                      <w:r>
-                        <w:t xml:space="preserve"> </w:t>
-                      </w:r>
-                      <w:r>
-                        <w:t>[0]</w:t>
+                        <w:t>]</w:t>
                       </w:r>
                     </w:p>
                   </w:txbxContent>
@@ -6576,18 +6626,46 @@
       <w:proofErr w:type="spellStart"/>
       <w:r>
         <w:rPr>
-          <w:rFonts w:ascii="Arial" w:eastAsia="Times New Roman" w:hAnsi="Arial" w:cs="Arial"/>
-          <w:color w:val="000000"/>
-        </w:rPr>
-        <w:t>KiCad’s</w:t>
+          <w:rFonts w:ascii="Arial" w:hAnsi="Arial" w:cs="Arial"/>
+          <w:color w:val="000000"/>
+        </w:rPr>
+        <w:t>K</w:t>
+      </w:r>
+      <w:r>
+        <w:rPr>
+          <w:rFonts w:ascii="Arial" w:hAnsi="Arial" w:cs="Arial"/>
+          <w:color w:val="000000"/>
+        </w:rPr>
+        <w:t>i</w:t>
+      </w:r>
+      <w:r>
+        <w:rPr>
+          <w:rFonts w:ascii="Arial" w:hAnsi="Arial" w:cs="Arial"/>
+          <w:color w:val="000000"/>
+        </w:rPr>
+        <w:t>Cad’s</w:t>
       </w:r>
       <w:proofErr w:type="spellEnd"/>
       <w:r>
         <w:rPr>
-          <w:rFonts w:ascii="Arial" w:eastAsia="Times New Roman" w:hAnsi="Arial" w:cs="Arial"/>
-          <w:color w:val="000000"/>
-        </w:rPr>
-        <w:t xml:space="preserve"> 3D viewer gives a realistic preview of the final PCB, helping verify component spacing, overall appearance, and detect issues before fabrication. the 3D view shows:</w:t>
+          <w:rFonts w:ascii="Arial" w:hAnsi="Arial" w:cs="Arial"/>
+          <w:color w:val="000000"/>
+        </w:rPr>
+        <w:t xml:space="preserve"> 3D viewer gives a realistic preview of the final PCB, helping verify component spacing, overall appearance, and detect issues before fabrication. </w:t>
+      </w:r>
+      <w:r>
+        <w:rPr>
+          <w:rFonts w:ascii="Arial" w:hAnsi="Arial" w:cs="Arial"/>
+          <w:color w:val="000000"/>
+        </w:rPr>
+        <w:t>T</w:t>
+      </w:r>
+      <w:r>
+        <w:rPr>
+          <w:rFonts w:ascii="Arial" w:hAnsi="Arial" w:cs="Arial"/>
+          <w:color w:val="000000"/>
+        </w:rPr>
+        <w:t>he 3D view shows:</w:t>
       </w:r>
     </w:p>
     <w:p>
@@ -6743,22 +6821,16 @@
                         <w:txbxContent>
                           <w:p>
                             <w:r>
-                              <w:t xml:space="preserve">Figure </w:t>
+                              <w:t>Figure 10. 3D View</w:t>
                             </w:r>
                             <w:r>
-                              <w:t>10</w:t>
+                              <w:t xml:space="preserve"> [</w:t>
                             </w:r>
                             <w:r>
-                              <w:t xml:space="preserve">. </w:t>
+                              <w:t>1</w:t>
                             </w:r>
                             <w:r>
-                              <w:t>3D View</w:t>
-                            </w:r>
-                            <w:r>
-                              <w:t xml:space="preserve"> </w:t>
-                            </w:r>
-                            <w:r>
-                              <w:t>[0]</w:t>
+                              <w:t>]</w:t>
                             </w:r>
                           </w:p>
                         </w:txbxContent>
@@ -6785,22 +6857,16 @@
                   <w:txbxContent>
                     <w:p>
                       <w:r>
-                        <w:t xml:space="preserve">Figure </w:t>
+                        <w:t>Figure 10. 3D View</w:t>
                       </w:r>
                       <w:r>
-                        <w:t>10</w:t>
+                        <w:t xml:space="preserve"> [</w:t>
                       </w:r>
                       <w:r>
-                        <w:t xml:space="preserve">. </w:t>
+                        <w:t>1</w:t>
                       </w:r>
                       <w:r>
-                        <w:t>3D View</w:t>
-                      </w:r>
-                      <w:r>
-                        <w:t xml:space="preserve"> </w:t>
-                      </w:r>
-                      <w:r>
-                        <w:t>[0]</w:t>
+                        <w:t>]</w:t>
                       </w:r>
                     </w:p>
                   </w:txbxContent>
@@ -7041,19 +7107,13 @@
                         <w:txbxContent>
                           <w:p>
                             <w:r>
-                              <w:t>Figure 1</w:t>
+                              <w:t>Figure 11. PCB Layout [</w:t>
                             </w:r>
                             <w:r>
                               <w:t>1</w:t>
                             </w:r>
                             <w:r>
-                              <w:t xml:space="preserve">. </w:t>
-                            </w:r>
-                            <w:r>
-                              <w:t xml:space="preserve">PCB Layout </w:t>
-                            </w:r>
-                            <w:r>
-                              <w:t>[0]</w:t>
+                              <w:t>]</w:t>
                             </w:r>
                           </w:p>
                         </w:txbxContent>
@@ -7080,19 +7140,13 @@
                   <w:txbxContent>
                     <w:p>
                       <w:r>
-                        <w:t>Figure 1</w:t>
+                        <w:t>Figure 11. PCB Layout [</w:t>
                       </w:r>
                       <w:r>
                         <w:t>1</w:t>
                       </w:r>
                       <w:r>
-                        <w:t xml:space="preserve">. </w:t>
-                      </w:r>
-                      <w:r>
-                        <w:t xml:space="preserve">PCB Layout </w:t>
-                      </w:r>
-                      <w:r>
-                        <w:t>[0]</w:t>
+                        <w:t>]</w:t>
                       </w:r>
                     </w:p>
                   </w:txbxContent>
@@ -7105,17 +7159,14 @@
       </w:r>
       <w:r>
         <w:rPr>
-          <w:rFonts w:ascii="Times New Roman" w:eastAsia="Times New Roman" w:hAnsi="Times New Roman" w:cs="Times New Roman"/>
           <w:noProof/>
-          <w:sz w:val="24"/>
-          <w:szCs w:val="24"/>
           <w:bdr w:val="none" w:sz="0" w:space="0" w:color="auto" w:frame="1"/>
         </w:rPr>
         <w:drawing>
-          <wp:inline distT="0" distB="0" distL="0" distR="0" wp14:anchorId="4467894D" wp14:editId="530B2FA1">
-            <wp:extent cx="2609850" cy="2785795"/>
-            <wp:effectExtent l="7302" t="0" r="7303" b="7302"/>
-            <wp:docPr id="5" name="Picture 5" descr="https://lh7-rt.googleusercontent.com/docsz/AD_4nXeAymIh92mGdjjzRJvxFHOuOeWa11SNJANUPigpDaE4VWs5FM0qD-kMXCJIKOlhbN9z8QA1OSD9VCwGl6UpXDYzyLeXkiBIjOz7yugPt-vdDdpTenuC6tCyxKjW6LLzeBvqHBwp?key=fj628g7GPDx10Zh_2UYNuA"/>
+          <wp:inline distT="0" distB="0" distL="0" distR="0">
+            <wp:extent cx="2438400" cy="2644768"/>
+            <wp:effectExtent l="0" t="0" r="0" b="3810"/>
+            <wp:docPr id="8" name="Picture 8" descr="https://lh7-rt.googleusercontent.com/docsz/AD_4nXeesblptWiK5QM991g7balFO1dsY0r2bz1WR5-z7TjC0KicDqzrkiIVjHx_G9DaDbh-m915dJc3F_Nx89ei3Svyka-wonRZbdl_N_fQGvKejvAs0lBnjnUhrDaVyP3IxegR8kIOZg?key=fj628g7GPDx10Zh_2UYNuA"/>
             <wp:cNvGraphicFramePr>
               <a:graphicFrameLocks xmlns:a="http://schemas.openxmlformats.org/drawingml/2006/main" noChangeAspect="1"/>
             </wp:cNvGraphicFramePr>
@@ -7123,7 +7174,7 @@
               <a:graphicData uri="http://schemas.openxmlformats.org/drawingml/2006/picture">
                 <pic:pic xmlns:pic="http://schemas.openxmlformats.org/drawingml/2006/picture">
                   <pic:nvPicPr>
-                    <pic:cNvPr id="0" name="Picture 11" descr="https://lh7-rt.googleusercontent.com/docsz/AD_4nXeAymIh92mGdjjzRJvxFHOuOeWa11SNJANUPigpDaE4VWs5FM0qD-kMXCJIKOlhbN9z8QA1OSD9VCwGl6UpXDYzyLeXkiBIjOz7yugPt-vdDdpTenuC6tCyxKjW6LLzeBvqHBwp?key=fj628g7GPDx10Zh_2UYNuA"/>
+                    <pic:cNvPr id="0" name="Picture 1" descr="https://lh7-rt.googleusercontent.com/docsz/AD_4nXeesblptWiK5QM991g7balFO1dsY0r2bz1WR5-z7TjC0KicDqzrkiIVjHx_G9DaDbh-m915dJc3F_Nx89ei3Svyka-wonRZbdl_N_fQGvKejvAs0lBnjnUhrDaVyP3IxegR8kIOZg?key=fj628g7GPDx10Zh_2UYNuA"/>
                     <pic:cNvPicPr>
                       <a:picLocks noChangeAspect="1" noChangeArrowheads="1"/>
                     </pic:cNvPicPr>
@@ -7142,9 +7193,9 @@
                     </a:stretch>
                   </pic:blipFill>
                   <pic:spPr bwMode="auto">
-                    <a:xfrm rot="16200000">
+                    <a:xfrm>
                       <a:off x="0" y="0"/>
-                      <a:ext cx="2618382" cy="2794902"/>
+                      <a:ext cx="2470027" cy="2679071"/>
                     </a:xfrm>
                     <a:prstGeom prst="rect">
                       <a:avLst/>
@@ -7334,19 +7385,13 @@
                         <w:txbxContent>
                           <w:p>
                             <w:r>
-                              <w:t>Figure 1</w:t>
+                              <w:t>Figure 12. Bill of Materials [</w:t>
                             </w:r>
                             <w:r>
-                              <w:t>2</w:t>
+                              <w:t>1</w:t>
                             </w:r>
                             <w:r>
-                              <w:t xml:space="preserve">. </w:t>
-                            </w:r>
-                            <w:r>
-                              <w:t xml:space="preserve">Bill of Materials </w:t>
-                            </w:r>
-                            <w:r>
-                              <w:t>[0]</w:t>
+                              <w:t>]</w:t>
                             </w:r>
                           </w:p>
                         </w:txbxContent>
@@ -7373,19 +7418,13 @@
                   <w:txbxContent>
                     <w:p>
                       <w:r>
-                        <w:t>Figure 1</w:t>
+                        <w:t>Figure 12. Bill of Materials [</w:t>
                       </w:r>
                       <w:r>
-                        <w:t>2</w:t>
+                        <w:t>1</w:t>
                       </w:r>
                       <w:r>
-                        <w:t xml:space="preserve">. </w:t>
-                      </w:r>
-                      <w:r>
-                        <w:t xml:space="preserve">Bill of Materials </w:t>
-                      </w:r>
-                      <w:r>
-                        <w:t>[0]</w:t>
+                        <w:t>]</w:t>
                       </w:r>
                     </w:p>
                   </w:txbxContent>
@@ -7522,19 +7561,13 @@
                         <w:txbxContent>
                           <w:p>
                             <w:r>
-                              <w:t>Figure 1</w:t>
+                              <w:t>Figure 13. Cost [</w:t>
                             </w:r>
                             <w:r>
-                              <w:t>3</w:t>
+                              <w:t>1</w:t>
                             </w:r>
                             <w:r>
-                              <w:t xml:space="preserve">. </w:t>
-                            </w:r>
-                            <w:r>
-                              <w:t xml:space="preserve">Cost </w:t>
-                            </w:r>
-                            <w:r>
-                              <w:t>[0]</w:t>
+                              <w:t>]</w:t>
                             </w:r>
                           </w:p>
                         </w:txbxContent>
@@ -7561,19 +7594,13 @@
                   <w:txbxContent>
                     <w:p>
                       <w:r>
-                        <w:t>Figure 1</w:t>
+                        <w:t>Figure 13. Cost [</w:t>
                       </w:r>
                       <w:r>
-                        <w:t>3</w:t>
+                        <w:t>1</w:t>
                       </w:r>
                       <w:r>
-                        <w:t xml:space="preserve">. </w:t>
-                      </w:r>
-                      <w:r>
-                        <w:t xml:space="preserve">Cost </w:t>
-                      </w:r>
-                      <w:r>
-                        <w:t>[0]</w:t>
+                        <w:t>]</w:t>
                       </w:r>
                     </w:p>
                   </w:txbxContent>
@@ -7771,7 +7798,21 @@
           <w:rFonts w:ascii="Arial" w:eastAsia="Times New Roman" w:hAnsi="Arial" w:cs="Arial"/>
           <w:color w:val="000000"/>
         </w:rPr>
-        <w:t>. [7]</w:t>
+        <w:t>. [</w:t>
+      </w:r>
+      <w:r>
+        <w:rPr>
+          <w:rFonts w:ascii="Arial" w:eastAsia="Times New Roman" w:hAnsi="Arial" w:cs="Arial"/>
+          <w:color w:val="000000"/>
+        </w:rPr>
+        <w:t>8</w:t>
+      </w:r>
+      <w:r>
+        <w:rPr>
+          <w:rFonts w:ascii="Arial" w:eastAsia="Times New Roman" w:hAnsi="Arial" w:cs="Arial"/>
+          <w:color w:val="000000"/>
+        </w:rPr>
+        <w:t>]</w:t>
       </w:r>
     </w:p>
     <w:p>
@@ -7954,16 +7995,13 @@
                         <w:txbxContent>
                           <w:p>
                             <w:r>
-                              <w:t>Figure 1</w:t>
+                              <w:t>Figure 14. Gerber Files [</w:t>
                             </w:r>
                             <w:r>
-                              <w:t>4</w:t>
+                              <w:t>1</w:t>
                             </w:r>
                             <w:r>
-                              <w:t xml:space="preserve">. </w:t>
-                            </w:r>
-                            <w:r>
-                              <w:t>Gerber Files [0]</w:t>
+                              <w:t>]</w:t>
                             </w:r>
                           </w:p>
                         </w:txbxContent>
@@ -7990,16 +8028,13 @@
                   <w:txbxContent>
                     <w:p>
                       <w:r>
-                        <w:t>Figure 1</w:t>
+                        <w:t>Figure 14. Gerber Files [</w:t>
                       </w:r>
                       <w:r>
-                        <w:t>4</w:t>
+                        <w:t>1</w:t>
                       </w:r>
                       <w:r>
-                        <w:t xml:space="preserve">. </w:t>
-                      </w:r>
-                      <w:r>
-                        <w:t>Gerber Files [0]</w:t>
+                        <w:t>]</w:t>
                       </w:r>
                     </w:p>
                   </w:txbxContent>
@@ -8032,6 +8067,197 @@
           <w:szCs w:val="32"/>
         </w:rPr>
       </w:pPr>
+      <w:r>
+        <w:rPr>
+          <w:rFonts w:ascii="Arial" w:eastAsia="Times New Roman" w:hAnsi="Arial" w:cs="Arial"/>
+          <w:noProof/>
+          <w:color w:val="000000"/>
+        </w:rPr>
+        <mc:AlternateContent>
+          <mc:Choice Requires="wps">
+            <w:drawing>
+              <wp:anchor distT="0" distB="0" distL="114300" distR="114300" simplePos="0" relativeHeight="251685888" behindDoc="0" locked="0" layoutInCell="1" allowOverlap="1" wp14:anchorId="5B049ECE" wp14:editId="5B4D37A0">
+                <wp:simplePos x="0" y="0"/>
+                <wp:positionH relativeFrom="margin">
+                  <wp:align>center</wp:align>
+                </wp:positionH>
+                <wp:positionV relativeFrom="paragraph">
+                  <wp:posOffset>1433195</wp:posOffset>
+                </wp:positionV>
+                <wp:extent cx="2181225" cy="323850"/>
+                <wp:effectExtent l="0" t="0" r="28575" b="19050"/>
+                <wp:wrapNone/>
+                <wp:docPr id="16" name="Text Box 16"/>
+                <wp:cNvGraphicFramePr/>
+                <a:graphic xmlns:a="http://schemas.openxmlformats.org/drawingml/2006/main">
+                  <a:graphicData uri="http://schemas.microsoft.com/office/word/2010/wordprocessingShape">
+                    <wps:wsp>
+                      <wps:cNvSpPr txBox="1"/>
+                      <wps:spPr>
+                        <a:xfrm>
+                          <a:off x="0" y="0"/>
+                          <a:ext cx="2181225" cy="323850"/>
+                        </a:xfrm>
+                        <a:prstGeom prst="rect">
+                          <a:avLst/>
+                        </a:prstGeom>
+                        <a:solidFill>
+                          <a:schemeClr val="lt1"/>
+                        </a:solidFill>
+                        <a:ln w="6350">
+                          <a:solidFill>
+                            <a:schemeClr val="bg1"/>
+                          </a:solidFill>
+                        </a:ln>
+                      </wps:spPr>
+                      <wps:txbx>
+                        <w:txbxContent>
+                          <w:p>
+                            <w:r>
+                              <w:t>Figure 1</w:t>
+                            </w:r>
+                            <w:r>
+                              <w:t>5</w:t>
+                            </w:r>
+                            <w:r>
+                              <w:t xml:space="preserve">. </w:t>
+                            </w:r>
+                            <w:r>
+                              <w:t xml:space="preserve">PCB Summary Table </w:t>
+                            </w:r>
+                            <w:r>
+                              <w:t>[</w:t>
+                            </w:r>
+                            <w:r>
+                              <w:t>1</w:t>
+                            </w:r>
+                            <w:r>
+                              <w:t>]</w:t>
+                            </w:r>
+                          </w:p>
+                        </w:txbxContent>
+                      </wps:txbx>
+                      <wps:bodyPr rot="0" spcFirstLastPara="0" vertOverflow="overflow" horzOverflow="overflow" vert="horz" wrap="square" lIns="91440" tIns="45720" rIns="91440" bIns="45720" numCol="1" spcCol="0" rtlCol="0" fromWordArt="0" anchor="t" anchorCtr="0" forceAA="0" compatLnSpc="1">
+                        <a:prstTxWarp prst="textNoShape">
+                          <a:avLst/>
+                        </a:prstTxWarp>
+                        <a:noAutofit/>
+                      </wps:bodyPr>
+                    </wps:wsp>
+                  </a:graphicData>
+                </a:graphic>
+                <wp14:sizeRelH relativeFrom="margin">
+                  <wp14:pctWidth>0</wp14:pctWidth>
+                </wp14:sizeRelH>
+              </wp:anchor>
+            </w:drawing>
+          </mc:Choice>
+          <mc:Fallback>
+            <w:pict>
+              <v:shape w14:anchorId="5B049ECE" id="Text Box 16" o:spid="_x0000_s1040" type="#_x0000_t202" style="position:absolute;margin-left:0;margin-top:112.85pt;width:171.75pt;height:25.5pt;z-index:251685888;visibility:visible;mso-wrap-style:square;mso-width-percent:0;mso-wrap-distance-left:9pt;mso-wrap-distance-top:0;mso-wrap-distance-right:9pt;mso-wrap-distance-bottom:0;mso-position-horizontal:center;mso-position-horizontal-relative:margin;mso-position-vertical:absolute;mso-position-vertical-relative:text;mso-width-percent:0;mso-width-relative:margin;v-text-anchor:top" o:gfxdata="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" fillcolor="white [3201]" strokecolor="white [3212]" strokeweight=".5pt">
+                <v:textbox>
+                  <w:txbxContent>
+                    <w:p>
+                      <w:r>
+                        <w:t>Figure 1</w:t>
+                      </w:r>
+                      <w:r>
+                        <w:t>5</w:t>
+                      </w:r>
+                      <w:r>
+                        <w:t xml:space="preserve">. </w:t>
+                      </w:r>
+                      <w:r>
+                        <w:t xml:space="preserve">PCB Summary Table </w:t>
+                      </w:r>
+                      <w:r>
+                        <w:t>[</w:t>
+                      </w:r>
+                      <w:r>
+                        <w:t>1</w:t>
+                      </w:r>
+                      <w:r>
+                        <w:t>]</w:t>
+                      </w:r>
+                    </w:p>
+                  </w:txbxContent>
+                </v:textbox>
+                <w10:wrap anchorx="margin"/>
+              </v:shape>
+            </w:pict>
+          </mc:Fallback>
+        </mc:AlternateContent>
+      </w:r>
+      <w:r>
+        <w:rPr>
+          <w:rFonts w:ascii="Arial" w:hAnsi="Arial" w:cs="Arial"/>
+          <w:noProof/>
+          <w:color w:val="000000"/>
+          <w:bdr w:val="none" w:sz="0" w:space="0" w:color="auto" w:frame="1"/>
+        </w:rPr>
+        <w:drawing>
+          <wp:inline distT="0" distB="0" distL="0" distR="0">
+            <wp:extent cx="6188710" cy="1430816"/>
+            <wp:effectExtent l="0" t="0" r="2540" b="0"/>
+            <wp:docPr id="9" name="Picture 9" descr="https://lh7-rt.googleusercontent.com/docsz/AD_4nXdMtCoXo5NgQzdBuf8fkBJ7NQ-rVVjyriSOcRH_cldqpFFn1HMs4qcmRN5TVKj1EPcaSYwcOShJVjoWIl-K2PlOu8BFVmh1rJzsinr2r5kMniOojRhh-m0sRrL7TnVFw_b1H5ZITw?key=fj628g7GPDx10Zh_2UYNuA"/>
+            <wp:cNvGraphicFramePr>
+              <a:graphicFrameLocks xmlns:a="http://schemas.openxmlformats.org/drawingml/2006/main" noChangeAspect="1"/>
+            </wp:cNvGraphicFramePr>
+            <a:graphic xmlns:a="http://schemas.openxmlformats.org/drawingml/2006/main">
+              <a:graphicData uri="http://schemas.openxmlformats.org/drawingml/2006/picture">
+                <pic:pic xmlns:pic="http://schemas.openxmlformats.org/drawingml/2006/picture">
+                  <pic:nvPicPr>
+                    <pic:cNvPr id="0" name="Picture 3" descr="https://lh7-rt.googleusercontent.com/docsz/AD_4nXdMtCoXo5NgQzdBuf8fkBJ7NQ-rVVjyriSOcRH_cldqpFFn1HMs4qcmRN5TVKj1EPcaSYwcOShJVjoWIl-K2PlOu8BFVmh1rJzsinr2r5kMniOojRhh-m0sRrL7TnVFw_b1H5ZITw?key=fj628g7GPDx10Zh_2UYNuA"/>
+                    <pic:cNvPicPr>
+                      <a:picLocks noChangeAspect="1" noChangeArrowheads="1"/>
+                    </pic:cNvPicPr>
+                  </pic:nvPicPr>
+                  <pic:blipFill>
+                    <a:blip r:embed="rId22">
+                      <a:extLst>
+                        <a:ext uri="{28A0092B-C50C-407E-A947-70E740481C1C}">
+                          <a14:useLocalDpi xmlns:a14="http://schemas.microsoft.com/office/drawing/2010/main" val="0"/>
+                        </a:ext>
+                      </a:extLst>
+                    </a:blip>
+                    <a:srcRect/>
+                    <a:stretch>
+                      <a:fillRect/>
+                    </a:stretch>
+                  </pic:blipFill>
+                  <pic:spPr bwMode="auto">
+                    <a:xfrm>
+                      <a:off x="0" y="0"/>
+                      <a:ext cx="6188710" cy="1430816"/>
+                    </a:xfrm>
+                    <a:prstGeom prst="rect">
+                      <a:avLst/>
+                    </a:prstGeom>
+                    <a:noFill/>
+                    <a:ln>
+                      <a:noFill/>
+                    </a:ln>
+                  </pic:spPr>
+                </pic:pic>
+              </a:graphicData>
+            </a:graphic>
+          </wp:inline>
+        </w:drawing>
+      </w:r>
+    </w:p>
+    <w:p>
+      <w:pPr>
+        <w:spacing w:after="200" w:line="240" w:lineRule="auto"/>
+        <w:textAlignment w:val="baseline"/>
+        <w:rPr>
+          <w:rFonts w:ascii="Arial" w:eastAsia="Times New Roman" w:hAnsi="Arial" w:cs="Arial"/>
+          <w:b/>
+          <w:bCs/>
+          <w:color w:val="000000"/>
+          <w:sz w:val="32"/>
+          <w:szCs w:val="32"/>
+        </w:rPr>
+      </w:pPr>
     </w:p>
     <w:p>
       <w:pPr>
@@ -8083,7 +8309,21 @@
           <w:rFonts w:ascii="Arial" w:eastAsia="Times New Roman" w:hAnsi="Arial" w:cs="Arial"/>
           <w:color w:val="000000"/>
         </w:rPr>
-        <w:t>[0] https://github.com/yoonsukwkd96/SS2025_HWE_Lab_Team1_VendingMachine</w:t>
+        <w:t>[</w:t>
+      </w:r>
+      <w:r>
+        <w:rPr>
+          <w:rFonts w:ascii="Arial" w:eastAsia="Times New Roman" w:hAnsi="Arial" w:cs="Arial"/>
+          <w:color w:val="000000"/>
+        </w:rPr>
+        <w:t>1</w:t>
+      </w:r>
+      <w:r>
+        <w:rPr>
+          <w:rFonts w:ascii="Arial" w:eastAsia="Times New Roman" w:hAnsi="Arial" w:cs="Arial"/>
+          <w:color w:val="000000"/>
+        </w:rPr>
+        <w:t>] https://github.com/yoonsukwkd96/SS2025_HWE_Lab_Team1_VendingMachine</w:t>
       </w:r>
     </w:p>
     <w:p>
@@ -8100,7 +8340,21 @@
           <w:rFonts w:ascii="Arial" w:eastAsia="Times New Roman" w:hAnsi="Arial" w:cs="Arial"/>
           <w:color w:val="000000"/>
         </w:rPr>
-        <w:t>[1] https://agilealliance.org/agile101/</w:t>
+        <w:t>[</w:t>
+      </w:r>
+      <w:r>
+        <w:rPr>
+          <w:rFonts w:ascii="Arial" w:eastAsia="Times New Roman" w:hAnsi="Arial" w:cs="Arial"/>
+          <w:color w:val="000000"/>
+        </w:rPr>
+        <w:t>2</w:t>
+      </w:r>
+      <w:r>
+        <w:rPr>
+          <w:rFonts w:ascii="Arial" w:eastAsia="Times New Roman" w:hAnsi="Arial" w:cs="Arial"/>
+          <w:color w:val="000000"/>
+        </w:rPr>
+        <w:t>] https://agilealliance.org/agile101/</w:t>
       </w:r>
     </w:p>
     <w:p>
@@ -8117,7 +8371,21 @@
           <w:rFonts w:ascii="Arial" w:eastAsia="Times New Roman" w:hAnsi="Arial" w:cs="Arial"/>
           <w:color w:val="000000"/>
         </w:rPr>
-        <w:t>[2] IEEE Standard VHDL Language Reference Manual, IEEE 1076-2019.</w:t>
+        <w:t>[</w:t>
+      </w:r>
+      <w:r>
+        <w:rPr>
+          <w:rFonts w:ascii="Arial" w:eastAsia="Times New Roman" w:hAnsi="Arial" w:cs="Arial"/>
+          <w:color w:val="000000"/>
+        </w:rPr>
+        <w:t>3</w:t>
+      </w:r>
+      <w:r>
+        <w:rPr>
+          <w:rFonts w:ascii="Arial" w:eastAsia="Times New Roman" w:hAnsi="Arial" w:cs="Arial"/>
+          <w:color w:val="000000"/>
+        </w:rPr>
+        <w:t>] IEEE Standard VHDL Language Reference Manual, IEEE 1076-2019.</w:t>
       </w:r>
     </w:p>
     <w:p>
@@ -8134,14 +8402,27 @@
           <w:rFonts w:ascii="Arial" w:eastAsia="Times New Roman" w:hAnsi="Arial" w:cs="Arial"/>
           <w:color w:val="000000"/>
         </w:rPr>
-        <w:t>[3] Siemens EDA - ModelSim Product Overview</w:t>
-      </w:r>
-      <w:hyperlink r:id="rId22" w:history="1">
+        <w:t>[</w:t>
+      </w:r>
+      <w:r>
+        <w:rPr>
+          <w:rFonts w:ascii="Arial" w:eastAsia="Times New Roman" w:hAnsi="Arial" w:cs="Arial"/>
+          <w:color w:val="000000"/>
+        </w:rPr>
+        <w:t>4</w:t>
+      </w:r>
+      <w:r>
+        <w:rPr>
+          <w:rFonts w:ascii="Arial" w:eastAsia="Times New Roman" w:hAnsi="Arial" w:cs="Arial"/>
+          <w:color w:val="000000"/>
+        </w:rPr>
+        <w:t>] Siemens EDA - ModelSim Product Overview</w:t>
+      </w:r>
+      <w:hyperlink r:id="rId23" w:history="1">
         <w:r>
           <w:rPr>
             <w:rFonts w:ascii="Arial" w:eastAsia="Times New Roman" w:hAnsi="Arial" w:cs="Arial"/>
             <w:color w:val="000000"/>
-            <w:u w:val="single"/>
           </w:rPr>
           <w:t xml:space="preserve"> https://eda.sw.siemens.com/en-US/ic/model/</w:t>
         </w:r>
@@ -8161,7 +8442,21 @@
           <w:rFonts w:ascii="Arial" w:eastAsia="Times New Roman" w:hAnsi="Arial" w:cs="Arial"/>
           <w:color w:val="000000"/>
         </w:rPr>
-        <w:t>[4] Roth, C. H., &amp; John, L. L. (2016). Digital Systems Design Using VHDL, 3rd Edition.</w:t>
+        <w:t>[</w:t>
+      </w:r>
+      <w:r>
+        <w:rPr>
+          <w:rFonts w:ascii="Arial" w:eastAsia="Times New Roman" w:hAnsi="Arial" w:cs="Arial"/>
+          <w:color w:val="000000"/>
+        </w:rPr>
+        <w:t>5</w:t>
+      </w:r>
+      <w:r>
+        <w:rPr>
+          <w:rFonts w:ascii="Arial" w:eastAsia="Times New Roman" w:hAnsi="Arial" w:cs="Arial"/>
+          <w:color w:val="000000"/>
+        </w:rPr>
+        <w:t>] Roth, C. H., &amp; John, L. L. (2016). Digital Systems Design Using VHDL, 3rd Edition.</w:t>
       </w:r>
     </w:p>
     <w:p>
@@ -8178,12 +8473,25 @@
           <w:rFonts w:ascii="Arial" w:eastAsia="Times New Roman" w:hAnsi="Arial" w:cs="Arial"/>
           <w:color w:val="000000"/>
         </w:rPr>
-        <w:t xml:space="preserve">[5] Cadence PCB Solutions (2023) </w:t>
-      </w:r>
-      <w:r>
-        <w:rPr>
-          <w:rFonts w:ascii="Arial" w:eastAsia="Times New Roman" w:hAnsi="Arial" w:cs="Arial"/>
-          <w:i/>
+        <w:t>[</w:t>
+      </w:r>
+      <w:r>
+        <w:rPr>
+          <w:rFonts w:ascii="Arial" w:eastAsia="Times New Roman" w:hAnsi="Arial" w:cs="Arial"/>
+          <w:color w:val="000000"/>
+        </w:rPr>
+        <w:t>6</w:t>
+      </w:r>
+      <w:r>
+        <w:rPr>
+          <w:rFonts w:ascii="Arial" w:eastAsia="Times New Roman" w:hAnsi="Arial" w:cs="Arial"/>
+          <w:color w:val="000000"/>
+        </w:rPr>
+        <w:t xml:space="preserve">] Cadence PCB Solutions (2023) </w:t>
+      </w:r>
+      <w:r>
+        <w:rPr>
+          <w:rFonts w:ascii="Arial" w:eastAsia="Times New Roman" w:hAnsi="Arial" w:cs="Arial"/>
           <w:iCs/>
           <w:color w:val="000000"/>
         </w:rPr>
@@ -8199,7 +8507,6 @@
       <w:r>
         <w:rPr>
           <w:rFonts w:ascii="Arial" w:eastAsia="Times New Roman" w:hAnsi="Arial" w:cs="Arial"/>
-          <w:i/>
           <w:iCs/>
           <w:color w:val="000000"/>
         </w:rPr>
@@ -8227,7 +8534,21 @@
           <w:rFonts w:ascii="Arial" w:eastAsia="Times New Roman" w:hAnsi="Arial" w:cs="Arial"/>
           <w:color w:val="000000"/>
         </w:rPr>
-        <w:t xml:space="preserve">[6] </w:t>
+        <w:t>[</w:t>
+      </w:r>
+      <w:r>
+        <w:rPr>
+          <w:rFonts w:ascii="Arial" w:eastAsia="Times New Roman" w:hAnsi="Arial" w:cs="Arial"/>
+          <w:color w:val="000000"/>
+        </w:rPr>
+        <w:t>7</w:t>
+      </w:r>
+      <w:r>
+        <w:rPr>
+          <w:rFonts w:ascii="Arial" w:eastAsia="Times New Roman" w:hAnsi="Arial" w:cs="Arial"/>
+          <w:color w:val="000000"/>
+        </w:rPr>
+        <w:t xml:space="preserve">] </w:t>
       </w:r>
       <w:proofErr w:type="gramStart"/>
       <w:r>
@@ -8248,7 +8569,6 @@
       <w:r>
         <w:rPr>
           <w:rFonts w:ascii="Arial" w:eastAsia="Times New Roman" w:hAnsi="Arial" w:cs="Arial"/>
-          <w:i/>
           <w:iCs/>
           <w:color w:val="000000"/>
         </w:rPr>
@@ -8264,7 +8584,6 @@
       <w:r>
         <w:rPr>
           <w:rFonts w:ascii="Arial" w:eastAsia="Times New Roman" w:hAnsi="Arial" w:cs="Arial"/>
-          <w:i/>
           <w:iCs/>
           <w:color w:val="000000"/>
         </w:rPr>
@@ -8291,12 +8610,25 @@
           <w:rFonts w:ascii="Arial" w:eastAsia="Times New Roman" w:hAnsi="Arial" w:cs="Arial"/>
           <w:color w:val="000000"/>
         </w:rPr>
-        <w:t xml:space="preserve">[7] Team, V.E. (2024) </w:t>
-      </w:r>
-      <w:r>
-        <w:rPr>
-          <w:rFonts w:ascii="Arial" w:eastAsia="Times New Roman" w:hAnsi="Arial" w:cs="Arial"/>
-          <w:i/>
+        <w:t>[</w:t>
+      </w:r>
+      <w:r>
+        <w:rPr>
+          <w:rFonts w:ascii="Arial" w:eastAsia="Times New Roman" w:hAnsi="Arial" w:cs="Arial"/>
+          <w:color w:val="000000"/>
+        </w:rPr>
+        <w:t>8</w:t>
+      </w:r>
+      <w:r>
+        <w:rPr>
+          <w:rFonts w:ascii="Arial" w:eastAsia="Times New Roman" w:hAnsi="Arial" w:cs="Arial"/>
+          <w:color w:val="000000"/>
+        </w:rPr>
+        <w:t xml:space="preserve">] Team, V.E. (2024) </w:t>
+      </w:r>
+      <w:r>
+        <w:rPr>
+          <w:rFonts w:ascii="Arial" w:eastAsia="Times New Roman" w:hAnsi="Arial" w:cs="Arial"/>
           <w:iCs/>
           <w:color w:val="000000"/>
         </w:rPr>
@@ -8312,7 +8644,6 @@
       <w:r>
         <w:rPr>
           <w:rFonts w:ascii="Arial" w:eastAsia="Times New Roman" w:hAnsi="Arial" w:cs="Arial"/>
-          <w:i/>
           <w:iCs/>
           <w:color w:val="000000"/>
         </w:rPr>
@@ -8345,46 +8676,6 @@
           <w:szCs w:val="24"/>
         </w:rPr>
       </w:pPr>
-    </w:p>
-    <w:p>
-      <w:pPr>
-        <w:spacing w:after="200" w:line="240" w:lineRule="auto"/>
-        <w:rPr>
-          <w:rFonts w:ascii="Times New Roman" w:eastAsia="Times New Roman" w:hAnsi="Times New Roman" w:cs="Times New Roman"/>
-          <w:sz w:val="24"/>
-          <w:szCs w:val="24"/>
-        </w:rPr>
-      </w:pPr>
-    </w:p>
-    <w:p>
-      <w:pPr>
-        <w:spacing w:after="200" w:line="240" w:lineRule="auto"/>
-        <w:rPr>
-          <w:rFonts w:ascii="Times New Roman" w:eastAsia="Times New Roman" w:hAnsi="Times New Roman" w:cs="Times New Roman"/>
-          <w:sz w:val="24"/>
-          <w:szCs w:val="24"/>
-        </w:rPr>
-      </w:pPr>
-    </w:p>
-    <w:p>
-      <w:pPr>
-        <w:spacing w:after="200" w:line="240" w:lineRule="auto"/>
-        <w:rPr>
-          <w:rFonts w:ascii="Times New Roman" w:eastAsia="Times New Roman" w:hAnsi="Times New Roman" w:cs="Times New Roman"/>
-          <w:sz w:val="24"/>
-          <w:szCs w:val="24"/>
-        </w:rPr>
-      </w:pPr>
-    </w:p>
-    <w:p>
-      <w:pPr>
-        <w:spacing w:after="200" w:line="240" w:lineRule="auto"/>
-        <w:rPr>
-          <w:rFonts w:ascii="Times New Roman" w:eastAsia="Times New Roman" w:hAnsi="Times New Roman" w:cs="Times New Roman"/>
-          <w:sz w:val="24"/>
-          <w:szCs w:val="24"/>
-        </w:rPr>
-      </w:pPr>
       <w:r>
         <w:rPr>
           <w:rFonts w:ascii="Arial" w:eastAsia="Times New Roman" w:hAnsi="Arial" w:cs="Arial"/>
@@ -8394,7 +8685,6 @@
           <w:sz w:val="32"/>
           <w:szCs w:val="32"/>
         </w:rPr>
-        <w:lastRenderedPageBreak/>
         <w:t xml:space="preserve">9. </w:t>
       </w:r>
       <w:r>
@@ -8425,10 +8715,7 @@
     <w:p>
       <w:proofErr w:type="gramStart"/>
       <w:r>
-        <w:t>9.1.1  VendingMachine_Top</w:t>
-      </w:r>
-      <w:r>
-        <w:t>.vhd</w:t>
+        <w:t>9.1.1  VendingMachine_Top.vhd</w:t>
       </w:r>
       <w:proofErr w:type="gramEnd"/>
     </w:p>
@@ -8455,7 +8742,7 @@
                     </pic:cNvPicPr>
                   </pic:nvPicPr>
                   <pic:blipFill>
-                    <a:blip r:embed="rId23">
+                    <a:blip r:embed="rId24">
                       <a:extLst>
                         <a:ext uri="{28A0092B-C50C-407E-A947-70E740481C1C}">
                           <a14:useLocalDpi xmlns:a14="http://schemas.microsoft.com/office/drawing/2010/main" val="0"/>
@@ -8491,10 +8778,6 @@
     <w:p/>
     <w:p/>
     <w:p/>
-    <w:p>
-      <w:bookmarkStart w:id="0" w:name="_GoBack"/>
-      <w:bookmarkEnd w:id="0"/>
-    </w:p>
     <w:p/>
     <w:p/>
     <w:p/>
@@ -8505,9 +8788,9 @@
     <w:p/>
     <w:p/>
     <w:p/>
-    <w:p>
-      <w:r>
-        <w:lastRenderedPageBreak/>
+    <w:p/>
+    <w:p>
+      <w:r>
         <w:t>9.1.2 FSM_Controller.vhd</w:t>
       </w:r>
     </w:p>
@@ -8545,7 +8828,7 @@
                     </pic:cNvPicPr>
                   </pic:nvPicPr>
                   <pic:blipFill>
-                    <a:blip r:embed="rId24">
+                    <a:blip r:embed="rId25">
                       <a:extLst>
                         <a:ext uri="{28A0092B-C50C-407E-A947-70E740481C1C}">
                           <a14:useLocalDpi xmlns:a14="http://schemas.microsoft.com/office/drawing/2010/main" val="0"/>
@@ -8598,7 +8881,7 @@
                     </pic:cNvPicPr>
                   </pic:nvPicPr>
                   <pic:blipFill>
-                    <a:blip r:embed="rId25">
+                    <a:blip r:embed="rId26">
                       <a:extLst>
                         <a:ext uri="{28A0092B-C50C-407E-A947-70E740481C1C}">
                           <a14:useLocalDpi xmlns:a14="http://schemas.microsoft.com/office/drawing/2010/main" val="0"/>
@@ -8654,7 +8937,7 @@
                     </pic:cNvPicPr>
                   </pic:nvPicPr>
                   <pic:blipFill>
-                    <a:blip r:embed="rId26">
+                    <a:blip r:embed="rId27">
                       <a:extLst>
                         <a:ext uri="{28A0092B-C50C-407E-A947-70E740481C1C}">
                           <a14:useLocalDpi xmlns:a14="http://schemas.microsoft.com/office/drawing/2010/main" val="0"/>
@@ -8707,7 +8990,7 @@
                     </pic:cNvPicPr>
                   </pic:nvPicPr>
                   <pic:blipFill>
-                    <a:blip r:embed="rId27">
+                    <a:blip r:embed="rId28">
                       <a:extLst>
                         <a:ext uri="{28A0092B-C50C-407E-A947-70E740481C1C}">
                           <a14:useLocalDpi xmlns:a14="http://schemas.microsoft.com/office/drawing/2010/main" val="0"/>
@@ -8771,7 +9054,7 @@
                     </pic:cNvPicPr>
                   </pic:nvPicPr>
                   <pic:blipFill>
-                    <a:blip r:embed="rId28">
+                    <a:blip r:embed="rId29">
                       <a:extLst>
                         <a:ext uri="{28A0092B-C50C-407E-A947-70E740481C1C}">
                           <a14:useLocalDpi xmlns:a14="http://schemas.microsoft.com/office/drawing/2010/main" val="0"/>
@@ -8824,7 +9107,7 @@
                     </pic:cNvPicPr>
                   </pic:nvPicPr>
                   <pic:blipFill>
-                    <a:blip r:embed="rId29">
+                    <a:blip r:embed="rId30">
                       <a:extLst>
                         <a:ext uri="{28A0092B-C50C-407E-A947-70E740481C1C}">
                           <a14:useLocalDpi xmlns:a14="http://schemas.microsoft.com/office/drawing/2010/main" val="0"/>
@@ -8885,7 +9168,7 @@
                     </pic:cNvPicPr>
                   </pic:nvPicPr>
                   <pic:blipFill>
-                    <a:blip r:embed="rId30">
+                    <a:blip r:embed="rId31">
                       <a:extLst>
                         <a:ext uri="{28A0092B-C50C-407E-A947-70E740481C1C}">
                           <a14:useLocalDpi xmlns:a14="http://schemas.microsoft.com/office/drawing/2010/main" val="0"/>
@@ -8918,7 +9201,7 @@
       </w:r>
     </w:p>
     <w:sectPr>
-      <w:headerReference w:type="default" r:id="rId31"/>
+      <w:headerReference w:type="default" r:id="rId32"/>
       <w:pgSz w:w="11906" w:h="16838"/>
       <w:pgMar w:top="1440" w:right="1080" w:bottom="1440" w:left="1080" w:header="708" w:footer="708" w:gutter="0"/>
       <w:cols w:space="708"/>

</xml_diff>

<commit_message>
Final editting from Choi
All I need to change has been changed. Other group members will update the report and extra implementation work to be done
</commit_message>
<xml_diff>
--- a/2. Projects/5. Final Submission/Vending Machine Controller Project Documentation.docx
+++ b/2. Projects/5. Final Submission/Vending Machine Controller Project Documentation.docx
@@ -65,8 +65,21 @@
           <w:sz w:val="32"/>
           <w:szCs w:val="32"/>
         </w:rPr>
-        <w:t>Team J</w:t>
-      </w:r>
+        <w:t xml:space="preserve">Team </w:t>
+      </w:r>
+      <w:r>
+        <w:rPr>
+          <w:rFonts w:ascii="Arial" w:eastAsia="Times New Roman" w:hAnsi="Arial" w:cs="Arial"/>
+          <w:i/>
+          <w:iCs/>
+          <w:color w:val="000000"/>
+          <w:sz w:val="32"/>
+          <w:szCs w:val="32"/>
+        </w:rPr>
+        <w:t>1</w:t>
+      </w:r>
+      <w:bookmarkStart w:id="0" w:name="_GoBack"/>
+      <w:bookmarkEnd w:id="0"/>
     </w:p>
     <w:p>
       <w:pPr>
@@ -868,7 +881,6 @@
           </mc:Fallback>
         </mc:AlternateContent>
       </w:r>
-      <w:bookmarkStart w:id="0" w:name="_GoBack"/>
       <w:r>
         <w:rPr>
           <w:rFonts w:ascii="Arial" w:eastAsia="Times New Roman" w:hAnsi="Arial" w:cs="Arial"/>
@@ -925,7 +937,6 @@
           </wp:inline>
         </w:drawing>
       </w:r>
-      <w:bookmarkEnd w:id="0"/>
     </w:p>
     <w:p>
       <w:pPr>
@@ -3672,23 +3683,7 @@
           <w:rFonts w:ascii="Arial" w:eastAsia="Times New Roman" w:hAnsi="Arial" w:cs="Arial"/>
           <w:color w:val="000000"/>
         </w:rPr>
-        <w:t xml:space="preserve">Test case 9: Check if the item 1 is displayed correctly if the </w:t>
-      </w:r>
-      <w:proofErr w:type="gramStart"/>
-      <w:r>
-        <w:rPr>
-          <w:rFonts w:ascii="Arial" w:eastAsia="Times New Roman" w:hAnsi="Arial" w:cs="Arial"/>
-          <w:color w:val="000000"/>
-        </w:rPr>
-        <w:t>SW(</w:t>
-      </w:r>
-      <w:proofErr w:type="gramEnd"/>
-      <w:r>
-        <w:rPr>
-          <w:rFonts w:ascii="Arial" w:eastAsia="Times New Roman" w:hAnsi="Arial" w:cs="Arial"/>
-          <w:color w:val="000000"/>
-        </w:rPr>
-        <w:t>0) is on. (</w:t>
+        <w:t>Test case 9: Check if the item 1 is displayed correctly if the SW(0) is on. (</w:t>
       </w:r>
       <w:proofErr w:type="spellStart"/>
       <w:r>
@@ -3725,23 +3720,7 @@
           <w:rFonts w:ascii="Arial" w:eastAsia="Times New Roman" w:hAnsi="Arial" w:cs="Arial"/>
           <w:color w:val="000000"/>
         </w:rPr>
-        <w:t xml:space="preserve">Test case 10: Check if the item 2 is displayed correctly if the </w:t>
-      </w:r>
-      <w:proofErr w:type="gramStart"/>
-      <w:r>
-        <w:rPr>
-          <w:rFonts w:ascii="Arial" w:eastAsia="Times New Roman" w:hAnsi="Arial" w:cs="Arial"/>
-          <w:color w:val="000000"/>
-        </w:rPr>
-        <w:t>SW(</w:t>
-      </w:r>
-      <w:proofErr w:type="gramEnd"/>
-      <w:r>
-        <w:rPr>
-          <w:rFonts w:ascii="Arial" w:eastAsia="Times New Roman" w:hAnsi="Arial" w:cs="Arial"/>
-          <w:color w:val="000000"/>
-        </w:rPr>
-        <w:t>1) is on. (</w:t>
+        <w:t>Test case 10: Check if the item 2 is displayed correctly if the SW(1) is on. (</w:t>
       </w:r>
       <w:proofErr w:type="spellStart"/>
       <w:r>
@@ -3778,23 +3757,7 @@
           <w:rFonts w:ascii="Arial" w:eastAsia="Times New Roman" w:hAnsi="Arial" w:cs="Arial"/>
           <w:color w:val="000000"/>
         </w:rPr>
-        <w:t xml:space="preserve">Test case 11:  Check if the item 3 is displayed correctly if the </w:t>
-      </w:r>
-      <w:proofErr w:type="gramStart"/>
-      <w:r>
-        <w:rPr>
-          <w:rFonts w:ascii="Arial" w:eastAsia="Times New Roman" w:hAnsi="Arial" w:cs="Arial"/>
-          <w:color w:val="000000"/>
-        </w:rPr>
-        <w:t>SW(</w:t>
-      </w:r>
-      <w:proofErr w:type="gramEnd"/>
-      <w:r>
-        <w:rPr>
-          <w:rFonts w:ascii="Arial" w:eastAsia="Times New Roman" w:hAnsi="Arial" w:cs="Arial"/>
-          <w:color w:val="000000"/>
-        </w:rPr>
-        <w:t>2) is on. (</w:t>
+        <w:t>Test case 11:  Check if the item 3 is displayed correctly if the SW(2) is on. (</w:t>
       </w:r>
       <w:proofErr w:type="spellStart"/>
       <w:r>
@@ -4245,17 +4208,8 @@
           <w:rFonts w:ascii="Arial" w:eastAsia="Times New Roman" w:hAnsi="Arial" w:cs="Arial"/>
           <w:color w:val="000000"/>
         </w:rPr>
-        <w:t xml:space="preserve"> </w:t>
-      </w:r>
-      <w:proofErr w:type="gramStart"/>
-      <w:r>
-        <w:rPr>
-          <w:rFonts w:ascii="Arial" w:eastAsia="Times New Roman" w:hAnsi="Arial" w:cs="Arial"/>
-          <w:color w:val="000000"/>
-        </w:rPr>
-        <w:t>  ’</w:t>
-      </w:r>
-      <w:proofErr w:type="gramEnd"/>
+        <w:t xml:space="preserve">   ’</w:t>
+      </w:r>
       <w:r>
         <w:rPr>
           <w:rFonts w:ascii="Arial" w:eastAsia="Times New Roman" w:hAnsi="Arial" w:cs="Arial"/>
@@ -5434,9 +5388,8 @@
           <w:u w:val="single"/>
         </w:rPr>
         <w:lastRenderedPageBreak/>
-        <w:t xml:space="preserve">Top </w:t>
-      </w:r>
-      <w:proofErr w:type="gramStart"/>
+        <w:t>Top Module</w:t>
+      </w:r>
       <w:r>
         <w:rPr>
           <w:rFonts w:ascii="Arial" w:eastAsia="Times New Roman" w:hAnsi="Arial" w:cs="Arial"/>
@@ -5445,28 +5398,7 @@
           <w:color w:val="000000"/>
           <w:u w:val="single"/>
         </w:rPr>
-        <w:t>Module</w:t>
-      </w:r>
-      <w:r>
-        <w:rPr>
-          <w:rFonts w:ascii="Arial" w:eastAsia="Times New Roman" w:hAnsi="Arial" w:cs="Arial"/>
-          <w:bCs/>
-          <w:iCs/>
-          <w:color w:val="000000"/>
-          <w:u w:val="single"/>
-        </w:rPr>
-        <w:t xml:space="preserve"> :</w:t>
-      </w:r>
-      <w:proofErr w:type="gramEnd"/>
-      <w:r>
-        <w:rPr>
-          <w:rFonts w:ascii="Arial" w:eastAsia="Times New Roman" w:hAnsi="Arial" w:cs="Arial"/>
-          <w:bCs/>
-          <w:iCs/>
-          <w:color w:val="000000"/>
-          <w:u w:val="single"/>
-        </w:rPr>
-        <w:t xml:space="preserve"> VendingMachine_Top</w:t>
+        <w:t xml:space="preserve"> : VendingMachine_Top</w:t>
       </w:r>
     </w:p>
     <w:p>
@@ -6629,43 +6561,15 @@
           <w:rFonts w:ascii="Arial" w:hAnsi="Arial" w:cs="Arial"/>
           <w:color w:val="000000"/>
         </w:rPr>
-        <w:t>K</w:t>
-      </w:r>
+        <w:t>KiCad’s</w:t>
+      </w:r>
+      <w:proofErr w:type="spellEnd"/>
       <w:r>
         <w:rPr>
           <w:rFonts w:ascii="Arial" w:hAnsi="Arial" w:cs="Arial"/>
           <w:color w:val="000000"/>
         </w:rPr>
-        <w:t>i</w:t>
-      </w:r>
-      <w:r>
-        <w:rPr>
-          <w:rFonts w:ascii="Arial" w:hAnsi="Arial" w:cs="Arial"/>
-          <w:color w:val="000000"/>
-        </w:rPr>
-        <w:t>Cad’s</w:t>
-      </w:r>
-      <w:proofErr w:type="spellEnd"/>
-      <w:r>
-        <w:rPr>
-          <w:rFonts w:ascii="Arial" w:hAnsi="Arial" w:cs="Arial"/>
-          <w:color w:val="000000"/>
-        </w:rPr>
-        <w:t xml:space="preserve"> 3D viewer gives a realistic preview of the final PCB, helping verify component spacing, overall appearance, and detect issues before fabrication. </w:t>
-      </w:r>
-      <w:r>
-        <w:rPr>
-          <w:rFonts w:ascii="Arial" w:hAnsi="Arial" w:cs="Arial"/>
-          <w:color w:val="000000"/>
-        </w:rPr>
-        <w:t>T</w:t>
-      </w:r>
-      <w:r>
-        <w:rPr>
-          <w:rFonts w:ascii="Arial" w:hAnsi="Arial" w:cs="Arial"/>
-          <w:color w:val="000000"/>
-        </w:rPr>
-        <w:t>he 3D view shows:</w:t>
+        <w:t xml:space="preserve"> 3D viewer gives a realistic preview of the final PCB, helping verify component spacing, overall appearance, and detect issues before fabrication. The 3D view shows:</w:t>
       </w:r>
     </w:p>
     <w:p>
@@ -7267,23 +7171,7 @@
           <w:rFonts w:ascii="Arial" w:eastAsia="Times New Roman" w:hAnsi="Arial" w:cs="Arial"/>
           <w:color w:val="000000"/>
         </w:rPr>
-        <w:t xml:space="preserve">According to the BOM list for this PCB we did use total 12 different elements. For Generating Building </w:t>
-      </w:r>
-      <w:proofErr w:type="gramStart"/>
-      <w:r>
-        <w:rPr>
-          <w:rFonts w:ascii="Arial" w:eastAsia="Times New Roman" w:hAnsi="Arial" w:cs="Arial"/>
-          <w:color w:val="000000"/>
-        </w:rPr>
-        <w:t>Of</w:t>
-      </w:r>
-      <w:proofErr w:type="gramEnd"/>
-      <w:r>
-        <w:rPr>
-          <w:rFonts w:ascii="Arial" w:eastAsia="Times New Roman" w:hAnsi="Arial" w:cs="Arial"/>
-          <w:color w:val="000000"/>
-        </w:rPr>
-        <w:t xml:space="preserve"> Material (BOM) I used a built in </w:t>
+        <w:t xml:space="preserve">According to the BOM list for this PCB we did use total 12 different elements. For Generating Building Of Material (BOM) I used a built in </w:t>
       </w:r>
       <w:r>
         <w:rPr>
@@ -7766,15 +7654,7 @@
           <w:rFonts w:ascii="Arial" w:eastAsia="Times New Roman" w:hAnsi="Arial" w:cs="Arial"/>
           <w:color w:val="000000"/>
         </w:rPr>
-        <w:t xml:space="preserve"> </w:t>
-      </w:r>
-      <w:proofErr w:type="gramStart"/>
-      <w:r>
-        <w:rPr>
-          <w:rFonts w:ascii="Arial" w:eastAsia="Times New Roman" w:hAnsi="Arial" w:cs="Arial"/>
-          <w:color w:val="000000"/>
-        </w:rPr>
-        <w:t xml:space="preserve">or </w:t>
+        <w:t xml:space="preserve"> or </w:t>
       </w:r>
       <w:r>
         <w:rPr>
@@ -7792,7 +7672,6 @@
         <w:t>gbr</w:t>
       </w:r>
       <w:proofErr w:type="spellEnd"/>
-      <w:proofErr w:type="gramEnd"/>
       <w:r>
         <w:rPr>
           <w:rFonts w:ascii="Arial" w:eastAsia="Times New Roman" w:hAnsi="Arial" w:cs="Arial"/>
@@ -8114,25 +7993,7 @@
                         <w:txbxContent>
                           <w:p>
                             <w:r>
-                              <w:t>Figure 1</w:t>
-                            </w:r>
-                            <w:r>
-                              <w:t>5</w:t>
-                            </w:r>
-                            <w:r>
-                              <w:t xml:space="preserve">. </w:t>
-                            </w:r>
-                            <w:r>
-                              <w:t xml:space="preserve">PCB Summary Table </w:t>
-                            </w:r>
-                            <w:r>
-                              <w:t>[</w:t>
-                            </w:r>
-                            <w:r>
-                              <w:t>1</w:t>
-                            </w:r>
-                            <w:r>
-                              <w:t>]</w:t>
+                              <w:t>Figure 15. PCB Summary Table [1]</w:t>
                             </w:r>
                           </w:p>
                         </w:txbxContent>
@@ -8159,25 +8020,7 @@
                   <w:txbxContent>
                     <w:p>
                       <w:r>
-                        <w:t>Figure 1</w:t>
-                      </w:r>
-                      <w:r>
-                        <w:t>5</w:t>
-                      </w:r>
-                      <w:r>
-                        <w:t xml:space="preserve">. </w:t>
-                      </w:r>
-                      <w:r>
-                        <w:t xml:space="preserve">PCB Summary Table </w:t>
-                      </w:r>
-                      <w:r>
-                        <w:t>[</w:t>
-                      </w:r>
-                      <w:r>
-                        <w:t>1</w:t>
-                      </w:r>
-                      <w:r>
-                        <w:t>]</w:t>
+                        <w:t>Figure 15. PCB Summary Table [1]</w:t>
                       </w:r>
                     </w:p>
                   </w:txbxContent>
@@ -8548,23 +8391,7 @@
           <w:rFonts w:ascii="Arial" w:eastAsia="Times New Roman" w:hAnsi="Arial" w:cs="Arial"/>
           <w:color w:val="000000"/>
         </w:rPr>
-        <w:t xml:space="preserve">] </w:t>
-      </w:r>
-      <w:proofErr w:type="gramStart"/>
-      <w:r>
-        <w:rPr>
-          <w:rFonts w:ascii="Arial" w:eastAsia="Times New Roman" w:hAnsi="Arial" w:cs="Arial"/>
-          <w:color w:val="000000"/>
-        </w:rPr>
-        <w:t>Peterson ,</w:t>
-      </w:r>
-      <w:proofErr w:type="gramEnd"/>
-      <w:r>
-        <w:rPr>
-          <w:rFonts w:ascii="Arial" w:eastAsia="Times New Roman" w:hAnsi="Arial" w:cs="Arial"/>
-          <w:color w:val="000000"/>
-        </w:rPr>
-        <w:t xml:space="preserve"> Z. (2020) </w:t>
+        <w:t xml:space="preserve">] Peterson , Z. (2020) </w:t>
       </w:r>
       <w:r>
         <w:rPr>
@@ -8713,11 +8540,9 @@
       </w:r>
     </w:p>
     <w:p>
-      <w:proofErr w:type="gramStart"/>
       <w:r>
         <w:t>9.1.1  VendingMachine_Top.vhd</w:t>
       </w:r>
-      <w:proofErr w:type="gramEnd"/>
     </w:p>
     <w:p>
       <w:r>

</xml_diff>